<commit_message>
Blueprint revised: study guides are generated from lessons already in Smart Learning; uploads moved to a later phase
Co-Authored-By: Claude Sonnet 5.5 <noreply@anthropic.com>
</commit_message>
<xml_diff>
--- a/docs/blueprints/Smart-Learning-Study-Tools-Blueprint.docx
+++ b/docs/blueprints/Smart-Learning-Study-Tools-Blueprint.docx
@@ -70,7 +70,7 @@
           <w:sz w:val="21"/>
           <w:szCs w:val="21"/>
         </w:rPr>
-        <w:t xml:space="preserve">Prepared 10 October 2026. This belongs to the Learning product only (assessments, results and report cards are not touched).</w:t>
+        <w:t xml:space="preserve">Prepared 10 October 2026, revised the same day: the source for study material is the lesson the teacher already built in Smart Learning, so no upload is needed for it. This belongs to the Learning product only (assessments, results and report cards are not touched).</w:t>
       </w:r>
     </w:p>
     <w:p>
@@ -249,7 +249,7 @@
           <w:sz w:val="21"/>
           <w:szCs w:val="21"/>
         </w:rPr>
-        <w:t xml:space="preserve">A hint-first AI tutor with safety flags and school consent, spaced-repetition flashcards that work offline, three-level lesson checks, topic tracking and a library. What is missing is the front door: letting a student (or teacher) turn their own material into practice.</w:t>
+        <w:t xml:space="preserve">A hint-first AI tutor with safety flags and school consent, spaced-repetition flashcards that work offline, three-level lesson checks, topic tracking and a library. What is missing is the step that turns a finished lesson into study material for students (flashcards, practice questions and a short guide) without the teacher doing any extra work.</w:t>
       </w:r>
     </w:p>
     <w:p>
@@ -286,7 +286,7 @@
           <w:sz w:val="21"/>
           <w:szCs w:val="21"/>
         </w:rPr>
-        <w:t xml:space="preserve">Teacher study packs: </w:t>
+        <w:t xml:space="preserve">Lesson study guides: </w:t>
       </w:r>
       <w:r>
         <w:rPr>
@@ -295,7 +295,7 @@
           <w:sz w:val="21"/>
           <w:szCs w:val="21"/>
         </w:rPr>
-        <w:t xml:space="preserve">a teacher uploads or picks material and Smart Learning drafts flashcards and a quiz with explanations; the teacher reviews and assigns it to a class. Safest to start with, because the content is teacher-owned and checked.</w:t>
+        <w:t xml:space="preserve">when a teacher publishes a lesson, Smart Learning drafts a study guide from it: the key terms as flashcards, practice questions at Support, Core and Stretch levels with explanations, and a short list of key points. The teacher checks it once. Nothing is uploaded, because the lesson is already in Smart Learning.</w:t>
       </w:r>
     </w:p>
     <w:p>
@@ -316,7 +316,7 @@
           <w:sz w:val="21"/>
           <w:szCs w:val="21"/>
         </w:rPr>
-        <w:t xml:space="preserve">Student study packs: </w:t>
+        <w:t xml:space="preserve">Ask your lesson: </w:t>
       </w:r>
       <w:r>
         <w:rPr>
@@ -325,7 +325,7 @@
           <w:sz w:val="21"/>
           <w:szCs w:val="21"/>
         </w:rPr>
-        <w:t xml:space="preserve">a student uploads their own notes (a PDF, a document, or a photo of handwritten notes) and gets flashcards and a quiz that cite the page they came from.</w:t>
+        <w:t xml:space="preserve">the tutor that already answers questions about a lesson, now also able to quiz the student and draw on the guide, still hint-first.</w:t>
       </w:r>
     </w:p>
     <w:p>
@@ -346,7 +346,7 @@
           <w:sz w:val="21"/>
           <w:szCs w:val="21"/>
         </w:rPr>
-        <w:t xml:space="preserve">Ask your material: </w:t>
+        <w:t xml:space="preserve">Today's practice: </w:t>
       </w:r>
       <w:r>
         <w:rPr>
@@ -355,7 +355,7 @@
           <w:sz w:val="21"/>
           <w:szCs w:val="21"/>
         </w:rPr>
-        <w:t xml:space="preserve">the existing tutor, extended to answer questions from the student's own pack with citations, hint-first.</w:t>
+        <w:t xml:space="preserve">one daily set that mixes due flashcards, weak topics from My Topics and new questions, so spaced practice happens by default.</w:t>
       </w:r>
     </w:p>
     <w:p>
@@ -376,7 +376,7 @@
           <w:sz w:val="21"/>
           <w:szCs w:val="21"/>
         </w:rPr>
-        <w:t xml:space="preserve">Today's practice: </w:t>
+        <w:t xml:space="preserve">Your own notes: </w:t>
       </w:r>
       <w:r>
         <w:rPr>
@@ -385,7 +385,7 @@
           <w:sz w:val="21"/>
           <w:szCs w:val="21"/>
         </w:rPr>
-        <w:t xml:space="preserve">one daily set that mixes due flashcards, weak topics from My Topics and new quiz questions, so spaced practice happens by default.</w:t>
+        <w:t xml:space="preserve">later, a student can add their own notes (a PDF or a photo of handwritten notes) for subjects or material that are not in a lesson, and get the same flashcards and quiz.</w:t>
       </w:r>
     </w:p>
     <w:p>
@@ -435,7 +435,7 @@
           <w:sz w:val="21"/>
           <w:szCs w:val="21"/>
         </w:rPr>
-        <w:t xml:space="preserve">On Anthropic's published prices, a study pack from a 20-page document costs about 9 cents with Claude Sonnet 5.5 or under half a cent with Claude Haiku 5.5. A student who makes 8 packs and sends 150 chat messages a month costs about $1.60 on Sonnet or about $0.10 on Haiku. These are estimates to be measured in the pilot (section 9).</w:t>
+        <w:t xml:space="preserve">A lesson guide is made once per lesson and shared by the whole class, so it costs about 9 cents per lesson on Claude Sonnet 5.5 (under half a cent on Claude Haiku 5.5), however many students use it. The ongoing cost is tutor messages: about half a cent each on Sonnet. These are estimates to be measured in the pilot (section 9).</w:t>
       </w:r>
     </w:p>
     <w:p>
@@ -3754,7 +3754,7 @@
                 <w:sz w:val="18"/>
                 <w:szCs w:val="18"/>
               </w:rPr>
-              <w:t xml:space="preserve">Upload own material</w:t>
+              <w:t xml:space="preserve">Study guide, flashcards and quiz made from a lesson</w:t>
             </w:r>
           </w:p>
         </w:tc>
@@ -3788,7 +3788,7 @@
                 <w:sz w:val="18"/>
                 <w:szCs w:val="18"/>
               </w:rPr>
-              <w:t xml:space="preserve">No</w:t>
+              <w:t xml:space="preserve">No. Teachers can already draft a student version of a lesson and AI-draft check questions, but there are no lesson flashcards and no guide.</w:t>
             </w:r>
           </w:p>
         </w:tc>
@@ -3822,7 +3822,7 @@
                 <w:sz w:val="18"/>
                 <w:szCs w:val="18"/>
               </w:rPr>
-              <w:t xml:space="preserve">Yes</w:t>
+              <w:t xml:space="preserve">Yes, from uploads</w:t>
             </w:r>
           </w:p>
         </w:tc>
@@ -3856,7 +3856,7 @@
                 <w:sz w:val="18"/>
                 <w:szCs w:val="18"/>
               </w:rPr>
-              <w:t xml:space="preserve">Main gap</w:t>
+              <w:t xml:space="preserve">Main gap, and the cheapest to close because the lesson already exists</w:t>
             </w:r>
           </w:p>
         </w:tc>
@@ -3896,7 +3896,7 @@
                 <w:sz w:val="18"/>
                 <w:szCs w:val="18"/>
               </w:rPr>
-              <w:t xml:space="preserve">Generated flashcards and quiz from material</w:t>
+              <w:t xml:space="preserve">Upload own notes</w:t>
             </w:r>
           </w:p>
         </w:tc>
@@ -3998,7 +3998,7 @@
                 <w:sz w:val="18"/>
                 <w:szCs w:val="18"/>
               </w:rPr>
-              <w:t xml:space="preserve">Main gap</w:t>
+              <w:t xml:space="preserve">Useful later, for material outside lessons</w:t>
             </w:r>
           </w:p>
         </w:tc>
@@ -4664,7 +4664,32 @@
           <w:sz w:val="25"/>
           <w:szCs w:val="25"/>
         </w:rPr>
-        <w:t xml:space="preserve">F1. Teacher study packs (build first)</w:t>
+        <w:t xml:space="preserve">F1. Lesson study guides (build first)</w:t>
+      </w:r>
+    </w:p>
+    <w:p>
+      <w:pPr>
+        <w:spacing w:after="120" w:before="0" w:line="288"/>
+      </w:pPr>
+      <w:r>
+        <w:rPr>
+          <w:rFonts w:ascii="Arial" w:cs="Arial" w:eastAsia="Arial" w:hAnsi="Arial"/>
+          <w:b/>
+          <w:bCs/>
+          <w:color w:val="1E1208"/>
+          <w:sz w:val="21"/>
+          <w:szCs w:val="21"/>
+        </w:rPr>
+        <w:t xml:space="preserve">Why this replaces "teacher uploads material". </w:t>
+      </w:r>
+      <w:r>
+        <w:rPr>
+          <w:rFonts w:ascii="Arial" w:cs="Arial" w:eastAsia="Arial" w:hAnsi="Arial"/>
+          <w:color w:val="1E1208"/>
+          <w:sz w:val="21"/>
+          <w:szCs w:val="21"/>
+        </w:rPr>
+        <w:t xml:space="preserve">A lesson already holds the teacher's five steps (Engage, Explore, Explain, Elaborate, Evaluate), their key terms, resources, subject, grade and topic, and the teacher has already approved it. That is better source material than any uploaded file: it is the teacher's own wording, aligned to the curriculum, already checked, and there is no copyright or personal data question.</w:t>
       </w:r>
     </w:p>
     <w:tbl>
@@ -4750,7 +4775,7 @@
                 <w:sz w:val="18"/>
                 <w:szCs w:val="18"/>
               </w:rPr>
-              <w:t xml:space="preserve">Opens "New study pack", uploads a PDF or Word file (or picks one of their own lessons), chooses subject, grade and a topic from the school topic list, and presses Draft. In about a minute there are 15 to 25 flashcards and 10 quiz questions at Support, Core and Stretch levels, each with an explanation and the page it came from. The teacher edits, removes anything wrong, approves, and assigns the pack to a class.</w:t>
+              <w:t xml:space="preserve">Publishes a lesson as they do now. A study guide draft appears next to it. They look it over, fix or remove anything, and switch it on. That is the only extra step. A "draft all guides" button covers lessons they already have.</w:t>
             </w:r>
           </w:p>
         </w:tc>
@@ -4822,7 +4847,7 @@
                 <w:sz w:val="18"/>
                 <w:szCs w:val="18"/>
               </w:rPr>
-              <w:t xml:space="preserve">A pack in their lessons list. "Study" opens flashcards with spaced repetition. "Quiz" asks a question first and explains afterwards. Wrong answers come back later.</w:t>
+              <w:t xml:space="preserve">A "Study guide" tab on the lesson, after the lesson: a few key points in plain words; the key terms as flashcards they can add to their own deck (spacing works as it does today); practice questions at their suggested level that ask first and explain after; and "what you should be able to do".</w:t>
             </w:r>
           </w:p>
         </w:tc>
@@ -4862,7 +4887,7 @@
                 <w:sz w:val="18"/>
                 <w:szCs w:val="18"/>
               </w:rPr>
-              <w:t xml:space="preserve">Why first</w:t>
+              <w:t xml:space="preserve">What is generated</w:t>
             </w:r>
           </w:p>
         </w:tc>
@@ -4894,7 +4919,7 @@
                 <w:sz w:val="18"/>
                 <w:szCs w:val="18"/>
               </w:rPr>
-              <w:t xml:space="preserve">The content is teacher-owned and checked before students see it, so there is no upload risk and no unreviewed AI content. It also gives us real accuracy and cost numbers before students can upload anything.</w:t>
+              <w:t xml:space="preserve">Key term cards (from the lesson's own key terms and the Explain step), 10 or so practice questions with explanations, five key points, and a "can you do this" list. Every item shows which step of the lesson it came from. Questions come first on the screen and the key points are short, because testing helps learning more than summaries do.</w:t>
             </w:r>
           </w:p>
         </w:tc>
@@ -4934,7 +4959,7 @@
                 <w:sz w:val="18"/>
                 <w:szCs w:val="18"/>
               </w:rPr>
-              <w:t xml:space="preserve">Reuses</w:t>
+              <w:t xml:space="preserve">One guide per lesson</w:t>
             </w:r>
           </w:p>
         </w:tc>
@@ -4966,7 +4991,7 @@
                 <w:sz w:val="18"/>
                 <w:szCs w:val="18"/>
               </w:rPr>
-              <w:t xml:space="preserve">The flashcard decks and spacing engine, lesson checks and their three levels, the teacher review pattern used for AI-drafted lesson checks, the monthly AI allowance, school topics, offline use.</w:t>
+              <w:t xml:space="preserve">It is generated once and shared by the class. Students get different questions by level and by weak topic, but no one waits for generation and the cost does not grow with the number of students.</w:t>
             </w:r>
           </w:p>
         </w:tc>
@@ -5006,7 +5031,7 @@
                 <w:sz w:val="18"/>
                 <w:szCs w:val="18"/>
               </w:rPr>
-              <w:t xml:space="preserve">New</w:t>
+              <w:t xml:space="preserve">Reuses</w:t>
             </w:r>
           </w:p>
         </w:tc>
@@ -5038,7 +5063,7 @@
                 <w:sz w:val="18"/>
                 <w:szCs w:val="18"/>
               </w:rPr>
-              <w:t xml:space="preserve">Study pack tables, a draft endpoint, a review and assign screen.</w:t>
+              <w:t xml:space="preserve">The lesson and its steps, key terms and topic, the three check levels and the existing AI drafting of check questions, the flashcard decks and spacing engine, the teacher review pattern, topics and My Topics, offline use, the school consent switch.</w:t>
             </w:r>
           </w:p>
         </w:tc>
@@ -5066,7 +5091,7 @@
           </w:tcPr>
           <w:p>
             <w:pPr>
-              <w:keepNext w:val="false"/>
+              <w:keepNext/>
               <w:spacing w:after="40" w:line="260"/>
             </w:pPr>
             <w:r>
@@ -5078,6 +5103,78 @@
                 <w:sz w:val="18"/>
                 <w:szCs w:val="18"/>
               </w:rPr>
+              <w:t xml:space="preserve">New</w:t>
+            </w:r>
+          </w:p>
+        </w:tc>
+        <w:tc>
+          <w:tcPr>
+            <w:tcW w:type="dxa" w:w="7938"/>
+            <w:tcBorders>
+              <w:top w:val="single" w:color="D8CFC2" w:sz="4"/>
+              <w:left w:val="single" w:color="D8CFC2" w:sz="4"/>
+              <w:bottom w:val="single" w:color="D8CFC2" w:sz="4"/>
+              <w:right w:val="single" w:color="D8CFC2" w:sz="4"/>
+            </w:tcBorders>
+            <w:tcMar>
+              <w:top w:type="dxa" w:w="70"/>
+              <w:left w:type="dxa" w:w="100"/>
+              <w:bottom w:type="dxa" w:w="70"/>
+              <w:right w:type="dxa" w:w="100"/>
+            </w:tcMar>
+          </w:tcPr>
+          <w:p>
+            <w:pPr>
+              <w:keepNext/>
+              <w:spacing w:after="40" w:line="260"/>
+            </w:pPr>
+            <w:r>
+              <w:rPr>
+                <w:rFonts w:ascii="Arial" w:cs="Arial" w:eastAsia="Arial" w:hAnsi="Arial"/>
+                <w:color w:val="1E1208"/>
+                <w:sz w:val="18"/>
+                <w:szCs w:val="18"/>
+              </w:rPr>
+              <w:t xml:space="preserve">A guide table, a draft step, a teacher review screen and the student guide tab.</w:t>
+            </w:r>
+          </w:p>
+        </w:tc>
+      </w:tr>
+      <w:tr>
+        <w:trPr>
+          <w:cantSplit/>
+        </w:trPr>
+        <w:tc>
+          <w:tcPr>
+            <w:tcW w:type="dxa" w:w="1700"/>
+            <w:tcBorders>
+              <w:top w:val="single" w:color="D8CFC2" w:sz="4"/>
+              <w:left w:val="single" w:color="D8CFC2" w:sz="4"/>
+              <w:bottom w:val="single" w:color="D8CFC2" w:sz="4"/>
+              <w:right w:val="single" w:color="D8CFC2" w:sz="4"/>
+            </w:tcBorders>
+            <w:shd w:fill="FBE9D6" w:color="auto" w:val="clear"/>
+            <w:tcMar>
+              <w:top w:type="dxa" w:w="70"/>
+              <w:left w:type="dxa" w:w="100"/>
+              <w:bottom w:type="dxa" w:w="70"/>
+              <w:right w:type="dxa" w:w="100"/>
+            </w:tcMar>
+          </w:tcPr>
+          <w:p>
+            <w:pPr>
+              <w:keepNext/>
+              <w:spacing w:after="40" w:line="260"/>
+            </w:pPr>
+            <w:r>
+              <w:rPr>
+                <w:rFonts w:ascii="Arial" w:cs="Arial" w:eastAsia="Arial" w:hAnsi="Arial"/>
+                <w:b/>
+                <w:bCs/>
+                <w:color w:val="1E1208"/>
+                <w:sz w:val="18"/>
+                <w:szCs w:val="18"/>
+              </w:rPr>
               <w:t xml:space="preserve">Size</w:t>
             </w:r>
           </w:p>
@@ -5100,17 +5197,89 @@
           </w:tcPr>
           <w:p>
             <w:pPr>
-              <w:keepNext w:val="false"/>
-              <w:spacing w:after="40" w:line="260"/>
-            </w:pPr>
-            <w:r>
-              <w:rPr>
-                <w:rFonts w:ascii="Arial" w:cs="Arial" w:eastAsia="Arial" w:hAnsi="Arial"/>
-                <w:color w:val="1E1208"/>
-                <w:sz w:val="18"/>
-                <w:szCs w:val="18"/>
-              </w:rPr>
-              <w:t xml:space="preserve">L</w:t>
+              <w:keepNext/>
+              <w:spacing w:after="40" w:line="260"/>
+            </w:pPr>
+            <w:r>
+              <w:rPr>
+                <w:rFonts w:ascii="Arial" w:cs="Arial" w:eastAsia="Arial" w:hAnsi="Arial"/>
+                <w:color w:val="1E1208"/>
+                <w:sz w:val="18"/>
+                <w:szCs w:val="18"/>
+              </w:rPr>
+              <w:t xml:space="preserve">M</w:t>
+            </w:r>
+          </w:p>
+        </w:tc>
+      </w:tr>
+      <w:tr>
+        <w:trPr>
+          <w:cantSplit/>
+        </w:trPr>
+        <w:tc>
+          <w:tcPr>
+            <w:tcW w:type="dxa" w:w="1700"/>
+            <w:tcBorders>
+              <w:top w:val="single" w:color="D8CFC2" w:sz="4"/>
+              <w:left w:val="single" w:color="D8CFC2" w:sz="4"/>
+              <w:bottom w:val="single" w:color="D8CFC2" w:sz="4"/>
+              <w:right w:val="single" w:color="D8CFC2" w:sz="4"/>
+            </w:tcBorders>
+            <w:shd w:fill="FBE9D6" w:color="auto" w:val="clear"/>
+            <w:tcMar>
+              <w:top w:type="dxa" w:w="70"/>
+              <w:left w:type="dxa" w:w="100"/>
+              <w:bottom w:type="dxa" w:w="70"/>
+              <w:right w:type="dxa" w:w="100"/>
+            </w:tcMar>
+          </w:tcPr>
+          <w:p>
+            <w:pPr>
+              <w:keepNext w:val="false"/>
+              <w:spacing w:after="40" w:line="260"/>
+            </w:pPr>
+            <w:r>
+              <w:rPr>
+                <w:rFonts w:ascii="Arial" w:cs="Arial" w:eastAsia="Arial" w:hAnsi="Arial"/>
+                <w:b/>
+                <w:bCs/>
+                <w:color w:val="1E1208"/>
+                <w:sz w:val="18"/>
+                <w:szCs w:val="18"/>
+              </w:rPr>
+              <w:t xml:space="preserve">Main risks</w:t>
+            </w:r>
+          </w:p>
+        </w:tc>
+        <w:tc>
+          <w:tcPr>
+            <w:tcW w:type="dxa" w:w="7938"/>
+            <w:tcBorders>
+              <w:top w:val="single" w:color="D8CFC2" w:sz="4"/>
+              <w:left w:val="single" w:color="D8CFC2" w:sz="4"/>
+              <w:bottom w:val="single" w:color="D8CFC2" w:sz="4"/>
+              <w:right w:val="single" w:color="D8CFC2" w:sz="4"/>
+            </w:tcBorders>
+            <w:tcMar>
+              <w:top w:type="dxa" w:w="70"/>
+              <w:left w:type="dxa" w:w="100"/>
+              <w:bottom w:type="dxa" w:w="70"/>
+              <w:right w:type="dxa" w:w="100"/>
+            </w:tcMar>
+          </w:tcPr>
+          <w:p>
+            <w:pPr>
+              <w:keepNext w:val="false"/>
+              <w:spacing w:after="40" w:line="260"/>
+            </w:pPr>
+            <w:r>
+              <w:rPr>
+                <w:rFonts w:ascii="Arial" w:cs="Arial" w:eastAsia="Arial" w:hAnsi="Arial"/>
+                <w:color w:val="1E1208"/>
+                <w:sz w:val="18"/>
+                <w:szCs w:val="18"/>
+              </w:rPr>
+              <w:t xml:space="preserve">A wrong card. Mitigated by the teacher check, source references to the lesson step, and a "report this" button.</w:t>
             </w:r>
           </w:p>
         </w:tc>
@@ -5136,7 +5305,7 @@
           <w:sz w:val="25"/>
           <w:szCs w:val="25"/>
         </w:rPr>
-        <w:t xml:space="preserve">F2. Student study packs</w:t>
+        <w:t xml:space="preserve">F2. Ask your lesson</w:t>
       </w:r>
     </w:p>
     <w:tbl>
@@ -5222,7 +5391,7 @@
                 <w:sz w:val="18"/>
                 <w:szCs w:val="18"/>
               </w:rPr>
-              <w:t xml:space="preserve">"Make a study pack": uploads their own notes as a PDF, a Word file or photos, picks the subject and gets flashcards and a quiz. Every card and question shows the page or photo it came from.</w:t>
+              <w:t xml:space="preserve">Asks a question inside the lesson, as now, and can also say "quiz me". The tutor uses the lesson and the guide, quotes the step the answer comes from, and gives a hint before an answer on practice questions.</w:t>
             </w:r>
           </w:p>
         </w:tc>
@@ -5262,7 +5431,7 @@
                 <w:sz w:val="18"/>
                 <w:szCs w:val="18"/>
               </w:rPr>
-              <w:t xml:space="preserve">Rules</w:t>
+              <w:t xml:space="preserve">How</w:t>
             </w:r>
           </w:p>
         </w:tc>
@@ -5294,7 +5463,7 @@
                 <w:sz w:val="18"/>
                 <w:szCs w:val="18"/>
               </w:rPr>
-              <w:t xml:space="preserve">Up to 30 pages or 10 MB per upload; 10 packs a month (adjustable); for the student's own studying and never shared with other students; a warning not to upload personal details and an automatic check for phone numbers and ID numbers; the original file is deleted within 24 hours; the school can switch the feature off.</w:t>
+              <w:t xml:space="preserve">The tutor already exists with its rules, flags and consent. This adds the guide as extra context and a quiz mode.</w:t>
             </w:r>
           </w:p>
         </w:tc>
@@ -5322,7 +5491,7 @@
           </w:tcPr>
           <w:p>
             <w:pPr>
-              <w:keepNext/>
+              <w:keepNext w:val="false"/>
               <w:spacing w:after="40" w:line="260"/>
             </w:pPr>
             <w:r>
@@ -5334,7 +5503,7 @@
                 <w:sz w:val="18"/>
                 <w:szCs w:val="18"/>
               </w:rPr>
-              <w:t xml:space="preserve">Reuses</w:t>
+              <w:t xml:space="preserve">Size</w:t>
             </w:r>
           </w:p>
         </w:tc>
@@ -5356,233 +5525,17 @@
           </w:tcPr>
           <w:p>
             <w:pPr>
-              <w:keepNext/>
-              <w:spacing w:after="40" w:line="260"/>
-            </w:pPr>
-            <w:r>
-              <w:rPr>
-                <w:rFonts w:ascii="Arial" w:cs="Arial" w:eastAsia="Arial" w:hAnsi="Arial"/>
-                <w:color w:val="1E1208"/>
-                <w:sz w:val="18"/>
-                <w:szCs w:val="18"/>
-              </w:rPr>
-              <w:t xml:space="preserve">The whole F1 pipeline, the school consent switch used for the AI tutor, the existing rate limits and flag review.</w:t>
-            </w:r>
-          </w:p>
-        </w:tc>
-      </w:tr>
-      <w:tr>
-        <w:trPr>
-          <w:cantSplit/>
-        </w:trPr>
-        <w:tc>
-          <w:tcPr>
-            <w:tcW w:type="dxa" w:w="1700"/>
-            <w:tcBorders>
-              <w:top w:val="single" w:color="D8CFC2" w:sz="4"/>
-              <w:left w:val="single" w:color="D8CFC2" w:sz="4"/>
-              <w:bottom w:val="single" w:color="D8CFC2" w:sz="4"/>
-              <w:right w:val="single" w:color="D8CFC2" w:sz="4"/>
-            </w:tcBorders>
-            <w:shd w:fill="FBE9D6" w:color="auto" w:val="clear"/>
-            <w:tcMar>
-              <w:top w:type="dxa" w:w="70"/>
-              <w:left w:type="dxa" w:w="100"/>
-              <w:bottom w:type="dxa" w:w="70"/>
-              <w:right w:type="dxa" w:w="100"/>
-            </w:tcMar>
-          </w:tcPr>
-          <w:p>
-            <w:pPr>
-              <w:keepNext/>
-              <w:spacing w:after="40" w:line="260"/>
-            </w:pPr>
-            <w:r>
-              <w:rPr>
-                <w:rFonts w:ascii="Arial" w:cs="Arial" w:eastAsia="Arial" w:hAnsi="Arial"/>
-                <w:b/>
-                <w:bCs/>
-                <w:color w:val="1E1208"/>
-                <w:sz w:val="18"/>
-                <w:szCs w:val="18"/>
-              </w:rPr>
-              <w:t xml:space="preserve">New</w:t>
-            </w:r>
-          </w:p>
-        </w:tc>
-        <w:tc>
-          <w:tcPr>
-            <w:tcW w:type="dxa" w:w="7938"/>
-            <w:tcBorders>
-              <w:top w:val="single" w:color="D8CFC2" w:sz="4"/>
-              <w:left w:val="single" w:color="D8CFC2" w:sz="4"/>
-              <w:bottom w:val="single" w:color="D8CFC2" w:sz="4"/>
-              <w:right w:val="single" w:color="D8CFC2" w:sz="4"/>
-            </w:tcBorders>
-            <w:tcMar>
-              <w:top w:type="dxa" w:w="70"/>
-              <w:left w:type="dxa" w:w="100"/>
-              <w:bottom w:type="dxa" w:w="70"/>
-              <w:right w:type="dxa" w:w="100"/>
-            </w:tcMar>
-          </w:tcPr>
-          <w:p>
-            <w:pPr>
-              <w:keepNext/>
-              <w:spacing w:after="40" w:line="260"/>
-            </w:pPr>
-            <w:r>
-              <w:rPr>
-                <w:rFonts w:ascii="Arial" w:cs="Arial" w:eastAsia="Arial" w:hAnsi="Arial"/>
-                <w:color w:val="1E1208"/>
-                <w:sz w:val="18"/>
-                <w:szCs w:val="18"/>
-              </w:rPr>
-              <w:t xml:space="preserve">Student upload screen, personal-data check, per-student allowance, "report a wrong card" button.</w:t>
-            </w:r>
-          </w:p>
-        </w:tc>
-      </w:tr>
-      <w:tr>
-        <w:trPr>
-          <w:cantSplit/>
-        </w:trPr>
-        <w:tc>
-          <w:tcPr>
-            <w:tcW w:type="dxa" w:w="1700"/>
-            <w:tcBorders>
-              <w:top w:val="single" w:color="D8CFC2" w:sz="4"/>
-              <w:left w:val="single" w:color="D8CFC2" w:sz="4"/>
-              <w:bottom w:val="single" w:color="D8CFC2" w:sz="4"/>
-              <w:right w:val="single" w:color="D8CFC2" w:sz="4"/>
-            </w:tcBorders>
-            <w:shd w:fill="FBE9D6" w:color="auto" w:val="clear"/>
-            <w:tcMar>
-              <w:top w:type="dxa" w:w="70"/>
-              <w:left w:type="dxa" w:w="100"/>
-              <w:bottom w:type="dxa" w:w="70"/>
-              <w:right w:type="dxa" w:w="100"/>
-            </w:tcMar>
-          </w:tcPr>
-          <w:p>
-            <w:pPr>
-              <w:keepNext/>
-              <w:spacing w:after="40" w:line="260"/>
-            </w:pPr>
-            <w:r>
-              <w:rPr>
-                <w:rFonts w:ascii="Arial" w:cs="Arial" w:eastAsia="Arial" w:hAnsi="Arial"/>
-                <w:b/>
-                <w:bCs/>
-                <w:color w:val="1E1208"/>
-                <w:sz w:val="18"/>
-                <w:szCs w:val="18"/>
-              </w:rPr>
-              <w:t xml:space="preserve">Size</w:t>
-            </w:r>
-          </w:p>
-        </w:tc>
-        <w:tc>
-          <w:tcPr>
-            <w:tcW w:type="dxa" w:w="7938"/>
-            <w:tcBorders>
-              <w:top w:val="single" w:color="D8CFC2" w:sz="4"/>
-              <w:left w:val="single" w:color="D8CFC2" w:sz="4"/>
-              <w:bottom w:val="single" w:color="D8CFC2" w:sz="4"/>
-              <w:right w:val="single" w:color="D8CFC2" w:sz="4"/>
-            </w:tcBorders>
-            <w:tcMar>
-              <w:top w:type="dxa" w:w="70"/>
-              <w:left w:type="dxa" w:w="100"/>
-              <w:bottom w:type="dxa" w:w="70"/>
-              <w:right w:type="dxa" w:w="100"/>
-            </w:tcMar>
-          </w:tcPr>
-          <w:p>
-            <w:pPr>
-              <w:keepNext/>
-              <w:spacing w:after="40" w:line="260"/>
-            </w:pPr>
-            <w:r>
-              <w:rPr>
-                <w:rFonts w:ascii="Arial" w:cs="Arial" w:eastAsia="Arial" w:hAnsi="Arial"/>
-                <w:color w:val="1E1208"/>
-                <w:sz w:val="18"/>
-                <w:szCs w:val="18"/>
-              </w:rPr>
-              <w:t xml:space="preserve">M after F1</w:t>
-            </w:r>
-          </w:p>
-        </w:tc>
-      </w:tr>
-      <w:tr>
-        <w:trPr>
-          <w:cantSplit/>
-        </w:trPr>
-        <w:tc>
-          <w:tcPr>
-            <w:tcW w:type="dxa" w:w="1700"/>
-            <w:tcBorders>
-              <w:top w:val="single" w:color="D8CFC2" w:sz="4"/>
-              <w:left w:val="single" w:color="D8CFC2" w:sz="4"/>
-              <w:bottom w:val="single" w:color="D8CFC2" w:sz="4"/>
-              <w:right w:val="single" w:color="D8CFC2" w:sz="4"/>
-            </w:tcBorders>
-            <w:shd w:fill="FBE9D6" w:color="auto" w:val="clear"/>
-            <w:tcMar>
-              <w:top w:type="dxa" w:w="70"/>
-              <w:left w:type="dxa" w:w="100"/>
-              <w:bottom w:type="dxa" w:w="70"/>
-              <w:right w:type="dxa" w:w="100"/>
-            </w:tcMar>
-          </w:tcPr>
-          <w:p>
-            <w:pPr>
-              <w:keepNext w:val="false"/>
-              <w:spacing w:after="40" w:line="260"/>
-            </w:pPr>
-            <w:r>
-              <w:rPr>
-                <w:rFonts w:ascii="Arial" w:cs="Arial" w:eastAsia="Arial" w:hAnsi="Arial"/>
-                <w:b/>
-                <w:bCs/>
-                <w:color w:val="1E1208"/>
-                <w:sz w:val="18"/>
-                <w:szCs w:val="18"/>
-              </w:rPr>
-              <w:t xml:space="preserve">Main risks</w:t>
-            </w:r>
-          </w:p>
-        </w:tc>
-        <w:tc>
-          <w:tcPr>
-            <w:tcW w:type="dxa" w:w="7938"/>
-            <w:tcBorders>
-              <w:top w:val="single" w:color="D8CFC2" w:sz="4"/>
-              <w:left w:val="single" w:color="D8CFC2" w:sz="4"/>
-              <w:bottom w:val="single" w:color="D8CFC2" w:sz="4"/>
-              <w:right w:val="single" w:color="D8CFC2" w:sz="4"/>
-            </w:tcBorders>
-            <w:tcMar>
-              <w:top w:type="dxa" w:w="70"/>
-              <w:left w:type="dxa" w:w="100"/>
-              <w:bottom w:type="dxa" w:w="70"/>
-              <w:right w:type="dxa" w:w="100"/>
-            </w:tcMar>
-          </w:tcPr>
-          <w:p>
-            <w:pPr>
-              <w:keepNext w:val="false"/>
-              <w:spacing w:after="40" w:line="260"/>
-            </w:pPr>
-            <w:r>
-              <w:rPr>
-                <w:rFonts w:ascii="Arial" w:cs="Arial" w:eastAsia="Arial" w:hAnsi="Arial"/>
-                <w:color w:val="1E1208"/>
-                <w:sz w:val="18"/>
-                <w:szCs w:val="18"/>
-              </w:rPr>
-              <w:t xml:space="preserve">Copyright of what is uploaded, personal data in uploads, and misuse. See section 8.</w:t>
+              <w:keepNext w:val="false"/>
+              <w:spacing w:after="40" w:line="260"/>
+            </w:pPr>
+            <w:r>
+              <w:rPr>
+                <w:rFonts w:ascii="Arial" w:cs="Arial" w:eastAsia="Arial" w:hAnsi="Arial"/>
+                <w:color w:val="1E1208"/>
+                <w:sz w:val="18"/>
+                <w:szCs w:val="18"/>
+              </w:rPr>
+              <w:t xml:space="preserve">S to M</w:t>
             </w:r>
           </w:p>
         </w:tc>
@@ -5608,7 +5561,7 @@
           <w:sz w:val="25"/>
           <w:szCs w:val="25"/>
         </w:rPr>
-        <w:t xml:space="preserve">F3. Ask your material</w:t>
+        <w:t xml:space="preserve">F3. Today's practice</w:t>
       </w:r>
     </w:p>
     <w:tbl>
@@ -5662,7 +5615,7 @@
                 <w:sz w:val="18"/>
                 <w:szCs w:val="18"/>
               </w:rPr>
-              <w:t xml:space="preserve">What the student does</w:t>
+              <w:t xml:space="preserve">What the student sees</w:t>
             </w:r>
           </w:p>
         </w:tc>
@@ -5694,7 +5647,7 @@
                 <w:sz w:val="18"/>
                 <w:szCs w:val="18"/>
               </w:rPr>
-              <w:t xml:space="preserve">Asks a question inside a pack. The answer is short, quotes the page it came from, and for practice questions gives a hint first. If the answer is not in their material the tutor says so and offers a clearly marked general explanation.</w:t>
+              <w:t xml:space="preserve">One card on the Smart Learning home page: "12 cards due, 4 questions on Fractions, 3 new". A ten minute session mixes due flashcards, topics My Topics shows are weak, and new questions from the guides of lessons they have done.</w:t>
             </w:r>
           </w:p>
         </w:tc>
@@ -5766,7 +5719,7 @@
                 <w:sz w:val="18"/>
                 <w:szCs w:val="18"/>
               </w:rPr>
-              <w:t xml:space="preserve">The existing tutor, with the lesson replaced by the pack's text. Small packs are sent whole with caching, which keeps messages cheap. Large packs retrieve the most relevant passages.</w:t>
+              <w:t xml:space="preserve">Uses spacing dates already stored, weak topics already computed and the guide questions. No new AI cost.</w:t>
             </w:r>
           </w:p>
         </w:tc>
@@ -5806,7 +5759,7 @@
                 <w:sz w:val="18"/>
                 <w:szCs w:val="18"/>
               </w:rPr>
-              <w:t xml:space="preserve">Reuses</w:t>
+              <w:t xml:space="preserve">Important</w:t>
             </w:r>
           </w:p>
         </w:tc>
@@ -5838,7 +5791,7 @@
                 <w:sz w:val="18"/>
                 <w:szCs w:val="18"/>
               </w:rPr>
-              <w:t xml:space="preserve">The tutor rules, safety flags, school consent, rate limits and the exam block.</w:t>
+              <w:t xml:space="preserve">Practice results are recorded separately from marks and never feed report cards or Assess.</w:t>
             </w:r>
           </w:p>
         </w:tc>
@@ -5936,7 +5889,7 @@
           <w:sz w:val="25"/>
           <w:szCs w:val="25"/>
         </w:rPr>
-        <w:t xml:space="preserve">F4. Today's practice</w:t>
+        <w:t xml:space="preserve">F4. Your own notes (later)</w:t>
       </w:r>
     </w:p>
     <w:tbl>
@@ -5990,7 +5943,7 @@
                 <w:sz w:val="18"/>
                 <w:szCs w:val="18"/>
               </w:rPr>
-              <w:t xml:space="preserve">What the student sees</w:t>
+              <w:t xml:space="preserve">What the student does</w:t>
             </w:r>
           </w:p>
         </w:tc>
@@ -6022,7 +5975,7 @@
                 <w:sz w:val="18"/>
                 <w:szCs w:val="18"/>
               </w:rPr>
-              <w:t xml:space="preserve">One card on the Smart Learning home page: "12 cards due, 4 questions on Fractions, 3 new". A ten minute session mixes due flashcards, topics that My Topics shows are weak, and new quiz questions, so spaced practice happens by default instead of by willpower.</w:t>
+              <w:t xml:space="preserve">Adds their own notes as a PDF, a Word file or photos of handwritten notes, picks the subject, and gets flashcards and a quiz with the page each came from. A photo is read back to them to correct before anything is made.</w:t>
             </w:r>
           </w:p>
         </w:tc>
@@ -6062,7 +6015,7 @@
                 <w:sz w:val="18"/>
                 <w:szCs w:val="18"/>
               </w:rPr>
-              <w:t xml:space="preserve">How</w:t>
+              <w:t xml:space="preserve">Why later</w:t>
             </w:r>
           </w:p>
         </w:tc>
@@ -6094,7 +6047,7 @@
                 <w:sz w:val="18"/>
                 <w:szCs w:val="18"/>
               </w:rPr>
-              <w:t xml:space="preserve">Uses spacing dates already stored, weak topics already computed, and unseen questions. No new AI cost.</w:t>
+              <w:t xml:space="preserve">It is the highest risk part (copyright, personal data, quality of photos) and the lessons already cover what teachers teach. It matters for material outside lessons, such as other subjects, notes taken in class and revision sheets.</w:t>
             </w:r>
           </w:p>
         </w:tc>
@@ -6134,7 +6087,7 @@
                 <w:sz w:val="18"/>
                 <w:szCs w:val="18"/>
               </w:rPr>
-              <w:t xml:space="preserve">Important</w:t>
+              <w:t xml:space="preserve">Rules</w:t>
             </w:r>
           </w:p>
         </w:tc>
@@ -6166,7 +6119,7 @@
                 <w:sz w:val="18"/>
                 <w:szCs w:val="18"/>
               </w:rPr>
-              <w:t xml:space="preserve">Practice results are recorded separately from marks and never feed report cards or Assess.</w:t>
+              <w:t xml:space="preserve">Up to 30 pages or 10 MB; 10 packs a month (adjustable); private to the student; a warning and an automatic check for personal details; original deleted within 24 hours; the school can switch it off.</w:t>
             </w:r>
           </w:p>
         </w:tc>
@@ -6238,7 +6191,7 @@
                 <w:sz w:val="18"/>
                 <w:szCs w:val="18"/>
               </w:rPr>
-              <w:t xml:space="preserve">M</w:t>
+              <w:t xml:space="preserve">L</w:t>
             </w:r>
           </w:p>
         </w:tc>
@@ -6264,7 +6217,7 @@
           <w:sz w:val="25"/>
           <w:szCs w:val="25"/>
         </w:rPr>
-        <w:t xml:space="preserve">F5. Photo of notes</w:t>
+        <w:t xml:space="preserve">F5. Teacher upload for material not in Smart Learning (small)</w:t>
       </w:r>
     </w:p>
     <w:tbl>
@@ -6318,7 +6271,7 @@
                 <w:sz w:val="18"/>
                 <w:szCs w:val="18"/>
               </w:rPr>
-              <w:t xml:space="preserve">What the student does</w:t>
+              <w:t xml:space="preserve">What it is</w:t>
             </w:r>
           </w:p>
         </w:tc>
@@ -6350,7 +6303,7 @@
                 <w:sz w:val="18"/>
                 <w:szCs w:val="18"/>
               </w:rPr>
-              <w:t xml:space="preserve">Photographs pages of handwritten notes or the board. The app reads the text and shows it back so the student can correct it before anything is generated.</w:t>
+              <w:t xml:space="preserve">A teacher can add a worksheet, past paper notes or a textbook extract that is not in a lesson and make a guide from it, using the same pipeline as F4 with the teacher review of F1.</w:t>
             </w:r>
           </w:p>
         </w:tc>
@@ -6378,7 +6331,7 @@
           </w:tcPr>
           <w:p>
             <w:pPr>
-              <w:keepNext/>
+              <w:keepNext w:val="false"/>
               <w:spacing w:after="40" w:line="260"/>
             </w:pPr>
             <w:r>
@@ -6390,7 +6343,7 @@
                 <w:sz w:val="18"/>
                 <w:szCs w:val="18"/>
               </w:rPr>
-              <w:t xml:space="preserve">Why it fits us</w:t>
+              <w:t xml:space="preserve">Size</w:t>
             </w:r>
           </w:p>
         </w:tc>
@@ -6412,161 +6365,17 @@
           </w:tcPr>
           <w:p>
             <w:pPr>
-              <w:keepNext/>
-              <w:spacing w:after="40" w:line="260"/>
-            </w:pPr>
-            <w:r>
-              <w:rPr>
-                <w:rFonts w:ascii="Arial" w:cs="Arial" w:eastAsia="Arial" w:hAnsi="Arial"/>
-                <w:color w:val="1E1208"/>
-                <w:sz w:val="18"/>
-                <w:szCs w:val="18"/>
-              </w:rPr>
-              <w:t xml:space="preserve">Most of our students' notes are handwritten. Turbo AI does not describe this at all.</w:t>
-            </w:r>
-          </w:p>
-        </w:tc>
-      </w:tr>
-      <w:tr>
-        <w:trPr>
-          <w:cantSplit/>
-        </w:trPr>
-        <w:tc>
-          <w:tcPr>
-            <w:tcW w:type="dxa" w:w="1700"/>
-            <w:tcBorders>
-              <w:top w:val="single" w:color="D8CFC2" w:sz="4"/>
-              <w:left w:val="single" w:color="D8CFC2" w:sz="4"/>
-              <w:bottom w:val="single" w:color="D8CFC2" w:sz="4"/>
-              <w:right w:val="single" w:color="D8CFC2" w:sz="4"/>
-            </w:tcBorders>
-            <w:shd w:fill="FBE9D6" w:color="auto" w:val="clear"/>
-            <w:tcMar>
-              <w:top w:type="dxa" w:w="70"/>
-              <w:left w:type="dxa" w:w="100"/>
-              <w:bottom w:type="dxa" w:w="70"/>
-              <w:right w:type="dxa" w:w="100"/>
-            </w:tcMar>
-          </w:tcPr>
-          <w:p>
-            <w:pPr>
-              <w:keepNext/>
-              <w:spacing w:after="40" w:line="260"/>
-            </w:pPr>
-            <w:r>
-              <w:rPr>
-                <w:rFonts w:ascii="Arial" w:cs="Arial" w:eastAsia="Arial" w:hAnsi="Arial"/>
-                <w:b/>
-                <w:bCs/>
-                <w:color w:val="1E1208"/>
-                <w:sz w:val="18"/>
-                <w:szCs w:val="18"/>
-              </w:rPr>
-              <w:t xml:space="preserve">Risks</w:t>
-            </w:r>
-          </w:p>
-        </w:tc>
-        <w:tc>
-          <w:tcPr>
-            <w:tcW w:type="dxa" w:w="7938"/>
-            <w:tcBorders>
-              <w:top w:val="single" w:color="D8CFC2" w:sz="4"/>
-              <w:left w:val="single" w:color="D8CFC2" w:sz="4"/>
-              <w:bottom w:val="single" w:color="D8CFC2" w:sz="4"/>
-              <w:right w:val="single" w:color="D8CFC2" w:sz="4"/>
-            </w:tcBorders>
-            <w:tcMar>
-              <w:top w:type="dxa" w:w="70"/>
-              <w:left w:type="dxa" w:w="100"/>
-              <w:bottom w:type="dxa" w:w="70"/>
-              <w:right w:type="dxa" w:w="100"/>
-            </w:tcMar>
-          </w:tcPr>
-          <w:p>
-            <w:pPr>
-              <w:keepNext/>
-              <w:spacing w:after="40" w:line="260"/>
-            </w:pPr>
-            <w:r>
-              <w:rPr>
-                <w:rFonts w:ascii="Arial" w:cs="Arial" w:eastAsia="Arial" w:hAnsi="Arial"/>
-                <w:color w:val="1E1208"/>
-                <w:sz w:val="18"/>
-                <w:szCs w:val="18"/>
-              </w:rPr>
-              <w:t xml:space="preserve">Poor photos and handwriting, diagrams and equations, and people in photos. Mitigated by the correction step, a "no faces" prompt and deleting the image after reading.</w:t>
-            </w:r>
-          </w:p>
-        </w:tc>
-      </w:tr>
-      <w:tr>
-        <w:trPr>
-          <w:cantSplit/>
-        </w:trPr>
-        <w:tc>
-          <w:tcPr>
-            <w:tcW w:type="dxa" w:w="1700"/>
-            <w:tcBorders>
-              <w:top w:val="single" w:color="D8CFC2" w:sz="4"/>
-              <w:left w:val="single" w:color="D8CFC2" w:sz="4"/>
-              <w:bottom w:val="single" w:color="D8CFC2" w:sz="4"/>
-              <w:right w:val="single" w:color="D8CFC2" w:sz="4"/>
-            </w:tcBorders>
-            <w:shd w:fill="FBE9D6" w:color="auto" w:val="clear"/>
-            <w:tcMar>
-              <w:top w:type="dxa" w:w="70"/>
-              <w:left w:type="dxa" w:w="100"/>
-              <w:bottom w:type="dxa" w:w="70"/>
-              <w:right w:type="dxa" w:w="100"/>
-            </w:tcMar>
-          </w:tcPr>
-          <w:p>
-            <w:pPr>
-              <w:keepNext w:val="false"/>
-              <w:spacing w:after="40" w:line="260"/>
-            </w:pPr>
-            <w:r>
-              <w:rPr>
-                <w:rFonts w:ascii="Arial" w:cs="Arial" w:eastAsia="Arial" w:hAnsi="Arial"/>
-                <w:b/>
-                <w:bCs/>
-                <w:color w:val="1E1208"/>
-                <w:sz w:val="18"/>
-                <w:szCs w:val="18"/>
-              </w:rPr>
-              <w:t xml:space="preserve">Size</w:t>
-            </w:r>
-          </w:p>
-        </w:tc>
-        <w:tc>
-          <w:tcPr>
-            <w:tcW w:type="dxa" w:w="7938"/>
-            <w:tcBorders>
-              <w:top w:val="single" w:color="D8CFC2" w:sz="4"/>
-              <w:left w:val="single" w:color="D8CFC2" w:sz="4"/>
-              <w:bottom w:val="single" w:color="D8CFC2" w:sz="4"/>
-              <w:right w:val="single" w:color="D8CFC2" w:sz="4"/>
-            </w:tcBorders>
-            <w:tcMar>
-              <w:top w:type="dxa" w:w="70"/>
-              <w:left w:type="dxa" w:w="100"/>
-              <w:bottom w:type="dxa" w:w="70"/>
-              <w:right w:type="dxa" w:w="100"/>
-            </w:tcMar>
-          </w:tcPr>
-          <w:p>
-            <w:pPr>
-              <w:keepNext w:val="false"/>
-              <w:spacing w:after="40" w:line="260"/>
-            </w:pPr>
-            <w:r>
-              <w:rPr>
-                <w:rFonts w:ascii="Arial" w:cs="Arial" w:eastAsia="Arial" w:hAnsi="Arial"/>
-                <w:color w:val="1E1208"/>
-                <w:sz w:val="18"/>
-                <w:szCs w:val="18"/>
-              </w:rPr>
-              <w:t xml:space="preserve">M</w:t>
+              <w:keepNext w:val="false"/>
+              <w:spacing w:after="40" w:line="260"/>
+            </w:pPr>
+            <w:r>
+              <w:rPr>
+                <w:rFonts w:ascii="Arial" w:cs="Arial" w:eastAsia="Arial" w:hAnsi="Arial"/>
+                <w:color w:val="1E1208"/>
+                <w:sz w:val="18"/>
+                <w:szCs w:val="18"/>
+              </w:rPr>
+              <w:t xml:space="preserve">S after F4</w:t>
             </w:r>
           </w:p>
         </w:tc>
@@ -6678,7 +6487,7 @@
                 <w:sz w:val="18"/>
                 <w:szCs w:val="18"/>
               </w:rPr>
-              <w:t xml:space="preserve">Presses "Listen" on a pack and hears the key points read aloud.</w:t>
+              <w:t xml:space="preserve">Presses "Listen" on a guide and hears the key points read aloud.</w:t>
             </w:r>
           </w:p>
         </w:tc>
@@ -6848,7 +6657,7 @@
           <w:sz w:val="25"/>
           <w:szCs w:val="25"/>
         </w:rPr>
-        <w:t xml:space="preserve">F7. Library chapter to pack</w:t>
+        <w:t xml:space="preserve">F7. Library chapter to guide</w:t>
       </w:r>
     </w:p>
     <w:tbl>
@@ -6934,7 +6743,7 @@
                 <w:sz w:val="18"/>
                 <w:szCs w:val="18"/>
               </w:rPr>
-              <w:t xml:space="preserve">Once the Smart Learning Library has books, a student or teacher can turn a chapter into a pack with the same pipeline.</w:t>
+              <w:t xml:space="preserve">Once the Smart Learning Library has books, a chapter can become a guide with the same pipeline.</w:t>
             </w:r>
           </w:p>
         </w:tc>
@@ -7006,7 +6815,7 @@
                 <w:sz w:val="18"/>
                 <w:szCs w:val="18"/>
               </w:rPr>
-              <w:t xml:space="preserve">S after F1</w:t>
+              <w:t xml:space="preserve">S after F4</w:t>
             </w:r>
           </w:p>
         </w:tc>
@@ -7535,6 +7344,20 @@
     </w:p>
     <w:p>
       <w:pPr>
+        <w:spacing w:after="120" w:before="0" w:line="288"/>
+      </w:pPr>
+      <w:r>
+        <w:rPr>
+          <w:rFonts w:ascii="Arial" w:cs="Arial" w:eastAsia="Arial" w:hAnsi="Arial"/>
+          <w:color w:val="1E1208"/>
+          <w:sz w:val="21"/>
+          <w:szCs w:val="21"/>
+        </w:rPr>
+        <w:t xml:space="preserve">A lesson needs none of steps 1 to 3 below: its text is already in the database, already split into steps, already approved and already tagged with a topic. Only uploads, photos and library chapters go through them.</w:t>
+      </w:r>
+    </w:p>
+    <w:p>
+      <w:pPr>
         <w:pStyle w:val="ListParagraph"/>
         <w:numPr>
           <w:ilvl w:val="0"/>
@@ -7946,7 +7769,7 @@
                 <w:sz w:val="18"/>
                 <w:szCs w:val="18"/>
               </w:rPr>
-              <w:t xml:space="preserve">One row per pack: owner, teacher or student kind, title, subject, grade, topic, status, class assignment, approval.</w:t>
+              <w:t xml:space="preserve">One row per guide or pack: where it came from (a lesson, an upload, a photo or a library chapter), the lesson it belongs to, owner, title, subject, grade, topic, status, and teacher approval. A lesson has one shared guide.</w:t>
             </w:r>
           </w:p>
         </w:tc>
@@ -8474,7 +8297,7 @@
           <w:sz w:val="21"/>
           <w:szCs w:val="21"/>
         </w:rPr>
-        <w:t xml:space="preserve">A student sees only their own packs and class packs a teacher approved for their class.</w:t>
+        <w:t xml:space="preserve">A lesson guide follows the lesson: a student can open it only if they can open the lesson, and only after the teacher has switched it on. Students see only their own personal packs.</w:t>
       </w:r>
     </w:p>
     <w:p>
@@ -8865,7 +8688,7 @@
                 <w:sz w:val="18"/>
                 <w:szCs w:val="18"/>
               </w:rPr>
-              <w:t xml:space="preserve">Personal data in uploads</w:t>
+              <w:t xml:space="preserve">Personal data</w:t>
             </w:r>
           </w:p>
         </w:tc>
@@ -8899,7 +8722,7 @@
                 <w:sz w:val="18"/>
                 <w:szCs w:val="18"/>
               </w:rPr>
-              <w:t xml:space="preserve">A clear warning, an automatic check for phone numbers, ID numbers and addresses, and the original file deleted within 24 hours. Prompts contain only the material.</w:t>
+              <w:t xml:space="preserve">Lesson guides contain no student data. For uploads: a clear warning, an automatic check for phone numbers, ID numbers and addresses, and the original file deleted within 24 hours. Prompts contain only the material.</w:t>
             </w:r>
           </w:p>
         </w:tc>
@@ -8973,7 +8796,7 @@
                 <w:sz w:val="18"/>
                 <w:szCs w:val="18"/>
               </w:rPr>
-              <w:t xml:space="preserve">Uploads are for the student's own studying, never shared with other students, deleted after reading. Teacher packs are made from materials the school may use. The school should say in writing what students may upload.</w:t>
+              <w:t xml:space="preserve">Lesson guides are made only from the school's own lessons. For the later upload phase: uploads are for the student's own studying, never shared with other students and deleted after reading, and the school should say in writing what students may upload.</w:t>
             </w:r>
           </w:p>
         </w:tc>
@@ -9801,7 +9624,7 @@
                 <w:sz w:val="18"/>
                 <w:szCs w:val="18"/>
               </w:rPr>
-              <w:t xml:space="preserve">Study pack from a 20 page document</w:t>
+              <w:t xml:space="preserve">A lesson study guide (once per lesson, shared by the class)</w:t>
             </w:r>
           </w:p>
         </w:tc>
@@ -9835,7 +9658,7 @@
                 <w:sz w:val="18"/>
                 <w:szCs w:val="18"/>
               </w:rPr>
-              <w:t xml:space="preserve">15,000 in, 6,000 out</w:t>
+              <w:t xml:space="preserve">8,000 in, 4,000 out</w:t>
             </w:r>
           </w:p>
         </w:tc>
@@ -9869,7 +9692,7 @@
                 <w:sz w:val="18"/>
                 <w:szCs w:val="18"/>
               </w:rPr>
-              <w:t xml:space="preserve">about $0.09</w:t>
+              <w:t xml:space="preserve">about $0.06</w:t>
             </w:r>
           </w:p>
         </w:tc>
@@ -9903,7 +9726,7 @@
                 <w:sz w:val="18"/>
                 <w:szCs w:val="18"/>
               </w:rPr>
-              <w:t xml:space="preserve">about $0.005</w:t>
+              <w:t xml:space="preserve">about $0.003</w:t>
             </w:r>
           </w:p>
         </w:tc>
@@ -9943,7 +9766,7 @@
                 <w:sz w:val="18"/>
                 <w:szCs w:val="18"/>
               </w:rPr>
-              <w:t xml:space="preserve">One tutor message on a cached pack</w:t>
+              <w:t xml:space="preserve">600 lessons in a year (all guides)</w:t>
             </w:r>
           </w:p>
         </w:tc>
@@ -9977,7 +9800,7 @@
                 <w:sz w:val="18"/>
                 <w:szCs w:val="18"/>
               </w:rPr>
-              <w:t xml:space="preserve">15,000 cached, 600 new, 300 out</w:t>
+              <w:t xml:space="preserve"/>
             </w:r>
           </w:p>
         </w:tc>
@@ -10011,7 +9834,7 @@
                 <w:sz w:val="18"/>
                 <w:szCs w:val="18"/>
               </w:rPr>
-              <w:t xml:space="preserve">about $0.006</w:t>
+              <w:t xml:space="preserve">about $36 a year</w:t>
             </w:r>
           </w:p>
         </w:tc>
@@ -10045,7 +9868,7 @@
                 <w:sz w:val="18"/>
                 <w:szCs w:val="18"/>
               </w:rPr>
-              <w:t xml:space="preserve">about $0.0004</w:t>
+              <w:t xml:space="preserve">about $2 a year</w:t>
             </w:r>
           </w:p>
         </w:tc>
@@ -10085,7 +9908,7 @@
                 <w:sz w:val="18"/>
                 <w:szCs w:val="18"/>
               </w:rPr>
-              <w:t xml:space="preserve">One student for a month (8 packs, 150 messages)</w:t>
+              <w:t xml:space="preserve">One tutor message on a cached lesson</w:t>
             </w:r>
           </w:p>
         </w:tc>
@@ -10119,7 +9942,7 @@
                 <w:sz w:val="18"/>
                 <w:szCs w:val="18"/>
               </w:rPr>
-              <w:t xml:space="preserve"/>
+              <w:t xml:space="preserve">10,000 cached, 600 new, 300 out</w:t>
             </w:r>
           </w:p>
         </w:tc>
@@ -10153,7 +9976,7 @@
                 <w:sz w:val="18"/>
                 <w:szCs w:val="18"/>
               </w:rPr>
-              <w:t xml:space="preserve">about $1.60</w:t>
+              <w:t xml:space="preserve">about $0.005</w:t>
             </w:r>
           </w:p>
         </w:tc>
@@ -10187,7 +10010,7 @@
                 <w:sz w:val="18"/>
                 <w:szCs w:val="18"/>
               </w:rPr>
-              <w:t xml:space="preserve">about $0.10</w:t>
+              <w:t xml:space="preserve">about $0.0003</w:t>
             </w:r>
           </w:p>
         </w:tc>
@@ -10227,7 +10050,7 @@
                 <w:sz w:val="18"/>
                 <w:szCs w:val="18"/>
               </w:rPr>
-              <w:t xml:space="preserve">Whole school, 30% of 1,800 students active</w:t>
+              <w:t xml:space="preserve">One student for a month (150 tutor messages)</w:t>
             </w:r>
           </w:p>
         </w:tc>
@@ -10295,7 +10118,7 @@
                 <w:sz w:val="18"/>
                 <w:szCs w:val="18"/>
               </w:rPr>
-              <w:t xml:space="preserve">about $875 a month</w:t>
+              <w:t xml:space="preserve">about $0.80</w:t>
             </w:r>
           </w:p>
         </w:tc>
@@ -10329,7 +10152,291 @@
                 <w:sz w:val="18"/>
                 <w:szCs w:val="18"/>
               </w:rPr>
-              <w:t xml:space="preserve">about $50 a month</w:t>
+              <w:t xml:space="preserve">about $0.05</w:t>
+            </w:r>
+          </w:p>
+        </w:tc>
+      </w:tr>
+      <w:tr>
+        <w:trPr>
+          <w:cantSplit/>
+        </w:trPr>
+        <w:tc>
+          <w:tcPr>
+            <w:tcW w:type="dxa" w:w="3100"/>
+            <w:tcBorders>
+              <w:top w:val="single" w:color="D8CFC2" w:sz="4"/>
+              <w:left w:val="single" w:color="D8CFC2" w:sz="4"/>
+              <w:bottom w:val="single" w:color="D8CFC2" w:sz="4"/>
+              <w:right w:val="single" w:color="D8CFC2" w:sz="4"/>
+            </w:tcBorders>
+            <w:shd w:fill="FBE9D6" w:color="auto" w:val="clear"/>
+            <w:tcMar>
+              <w:top w:type="dxa" w:w="70"/>
+              <w:left w:type="dxa" w:w="100"/>
+              <w:bottom w:type="dxa" w:w="70"/>
+              <w:right w:type="dxa" w:w="100"/>
+            </w:tcMar>
+          </w:tcPr>
+          <w:p>
+            <w:pPr>
+              <w:keepNext w:val="false"/>
+              <w:spacing w:after="40" w:line="260"/>
+            </w:pPr>
+            <w:r>
+              <w:rPr>
+                <w:rFonts w:ascii="Arial" w:cs="Arial" w:eastAsia="Arial" w:hAnsi="Arial"/>
+                <w:b/>
+                <w:bCs/>
+                <w:color w:val="1E1208"/>
+                <w:sz w:val="18"/>
+                <w:szCs w:val="18"/>
+              </w:rPr>
+              <w:t xml:space="preserve">Whole school, 30% of 1,800 students active</w:t>
+            </w:r>
+          </w:p>
+        </w:tc>
+        <w:tc>
+          <w:tcPr>
+            <w:tcW w:type="dxa" w:w="1800"/>
+            <w:tcBorders>
+              <w:top w:val="single" w:color="D8CFC2" w:sz="4"/>
+              <w:left w:val="single" w:color="D8CFC2" w:sz="4"/>
+              <w:bottom w:val="single" w:color="D8CFC2" w:sz="4"/>
+              <w:right w:val="single" w:color="D8CFC2" w:sz="4"/>
+            </w:tcBorders>
+            <w:tcMar>
+              <w:top w:type="dxa" w:w="70"/>
+              <w:left w:type="dxa" w:w="100"/>
+              <w:bottom w:type="dxa" w:w="70"/>
+              <w:right w:type="dxa" w:w="100"/>
+            </w:tcMar>
+          </w:tcPr>
+          <w:p>
+            <w:pPr>
+              <w:keepNext w:val="false"/>
+              <w:spacing w:after="40" w:line="260"/>
+            </w:pPr>
+            <w:r>
+              <w:rPr>
+                <w:rFonts w:ascii="Arial" w:cs="Arial" w:eastAsia="Arial" w:hAnsi="Arial"/>
+                <w:b w:val="false"/>
+                <w:bCs w:val="false"/>
+                <w:color w:val="1E1208"/>
+                <w:sz w:val="18"/>
+                <w:szCs w:val="18"/>
+              </w:rPr>
+              <w:t xml:space="preserve"/>
+            </w:r>
+          </w:p>
+        </w:tc>
+        <w:tc>
+          <w:tcPr>
+            <w:tcW w:type="dxa" w:w="2300"/>
+            <w:tcBorders>
+              <w:top w:val="single" w:color="D8CFC2" w:sz="4"/>
+              <w:left w:val="single" w:color="D8CFC2" w:sz="4"/>
+              <w:bottom w:val="single" w:color="D8CFC2" w:sz="4"/>
+              <w:right w:val="single" w:color="D8CFC2" w:sz="4"/>
+            </w:tcBorders>
+            <w:tcMar>
+              <w:top w:type="dxa" w:w="70"/>
+              <w:left w:type="dxa" w:w="100"/>
+              <w:bottom w:type="dxa" w:w="70"/>
+              <w:right w:type="dxa" w:w="100"/>
+            </w:tcMar>
+          </w:tcPr>
+          <w:p>
+            <w:pPr>
+              <w:keepNext w:val="false"/>
+              <w:spacing w:after="40" w:line="260"/>
+            </w:pPr>
+            <w:r>
+              <w:rPr>
+                <w:rFonts w:ascii="Arial" w:cs="Arial" w:eastAsia="Arial" w:hAnsi="Arial"/>
+                <w:b w:val="false"/>
+                <w:bCs w:val="false"/>
+                <w:color w:val="1E1208"/>
+                <w:sz w:val="18"/>
+                <w:szCs w:val="18"/>
+              </w:rPr>
+              <w:t xml:space="preserve">about $420 a month</w:t>
+            </w:r>
+          </w:p>
+        </w:tc>
+        <w:tc>
+          <w:tcPr>
+            <w:tcW w:type="dxa" w:w="2438"/>
+            <w:tcBorders>
+              <w:top w:val="single" w:color="D8CFC2" w:sz="4"/>
+              <w:left w:val="single" w:color="D8CFC2" w:sz="4"/>
+              <w:bottom w:val="single" w:color="D8CFC2" w:sz="4"/>
+              <w:right w:val="single" w:color="D8CFC2" w:sz="4"/>
+            </w:tcBorders>
+            <w:tcMar>
+              <w:top w:type="dxa" w:w="70"/>
+              <w:left w:type="dxa" w:w="100"/>
+              <w:bottom w:type="dxa" w:w="70"/>
+              <w:right w:type="dxa" w:w="100"/>
+            </w:tcMar>
+          </w:tcPr>
+          <w:p>
+            <w:pPr>
+              <w:keepNext w:val="false"/>
+              <w:spacing w:after="40" w:line="260"/>
+            </w:pPr>
+            <w:r>
+              <w:rPr>
+                <w:rFonts w:ascii="Arial" w:cs="Arial" w:eastAsia="Arial" w:hAnsi="Arial"/>
+                <w:b w:val="false"/>
+                <w:bCs w:val="false"/>
+                <w:color w:val="1E1208"/>
+                <w:sz w:val="18"/>
+                <w:szCs w:val="18"/>
+              </w:rPr>
+              <w:t xml:space="preserve">about $25 a month</w:t>
+            </w:r>
+          </w:p>
+        </w:tc>
+      </w:tr>
+      <w:tr>
+        <w:trPr>
+          <w:cantSplit/>
+        </w:trPr>
+        <w:tc>
+          <w:tcPr>
+            <w:tcW w:type="dxa" w:w="3100"/>
+            <w:tcBorders>
+              <w:top w:val="single" w:color="D8CFC2" w:sz="4"/>
+              <w:left w:val="single" w:color="D8CFC2" w:sz="4"/>
+              <w:bottom w:val="single" w:color="D8CFC2" w:sz="4"/>
+              <w:right w:val="single" w:color="D8CFC2" w:sz="4"/>
+            </w:tcBorders>
+            <w:shd w:fill="FBE9D6" w:color="auto" w:val="clear"/>
+            <w:tcMar>
+              <w:top w:type="dxa" w:w="70"/>
+              <w:left w:type="dxa" w:w="100"/>
+              <w:bottom w:type="dxa" w:w="70"/>
+              <w:right w:type="dxa" w:w="100"/>
+            </w:tcMar>
+          </w:tcPr>
+          <w:p>
+            <w:pPr>
+              <w:keepNext w:val="false"/>
+              <w:spacing w:after="40" w:line="260"/>
+            </w:pPr>
+            <w:r>
+              <w:rPr>
+                <w:rFonts w:ascii="Arial" w:cs="Arial" w:eastAsia="Arial" w:hAnsi="Arial"/>
+                <w:b/>
+                <w:bCs/>
+                <w:color w:val="1E1208"/>
+                <w:sz w:val="18"/>
+                <w:szCs w:val="18"/>
+              </w:rPr>
+              <w:t xml:space="preserve">A student's own pack from 20 pages (later phase)</w:t>
+            </w:r>
+          </w:p>
+        </w:tc>
+        <w:tc>
+          <w:tcPr>
+            <w:tcW w:type="dxa" w:w="1800"/>
+            <w:tcBorders>
+              <w:top w:val="single" w:color="D8CFC2" w:sz="4"/>
+              <w:left w:val="single" w:color="D8CFC2" w:sz="4"/>
+              <w:bottom w:val="single" w:color="D8CFC2" w:sz="4"/>
+              <w:right w:val="single" w:color="D8CFC2" w:sz="4"/>
+            </w:tcBorders>
+            <w:tcMar>
+              <w:top w:type="dxa" w:w="70"/>
+              <w:left w:type="dxa" w:w="100"/>
+              <w:bottom w:type="dxa" w:w="70"/>
+              <w:right w:type="dxa" w:w="100"/>
+            </w:tcMar>
+          </w:tcPr>
+          <w:p>
+            <w:pPr>
+              <w:keepNext w:val="false"/>
+              <w:spacing w:after="40" w:line="260"/>
+            </w:pPr>
+            <w:r>
+              <w:rPr>
+                <w:rFonts w:ascii="Arial" w:cs="Arial" w:eastAsia="Arial" w:hAnsi="Arial"/>
+                <w:b w:val="false"/>
+                <w:bCs w:val="false"/>
+                <w:color w:val="1E1208"/>
+                <w:sz w:val="18"/>
+                <w:szCs w:val="18"/>
+              </w:rPr>
+              <w:t xml:space="preserve">15,000 in, 6,000 out</w:t>
+            </w:r>
+          </w:p>
+        </w:tc>
+        <w:tc>
+          <w:tcPr>
+            <w:tcW w:type="dxa" w:w="2300"/>
+            <w:tcBorders>
+              <w:top w:val="single" w:color="D8CFC2" w:sz="4"/>
+              <w:left w:val="single" w:color="D8CFC2" w:sz="4"/>
+              <w:bottom w:val="single" w:color="D8CFC2" w:sz="4"/>
+              <w:right w:val="single" w:color="D8CFC2" w:sz="4"/>
+            </w:tcBorders>
+            <w:tcMar>
+              <w:top w:type="dxa" w:w="70"/>
+              <w:left w:type="dxa" w:w="100"/>
+              <w:bottom w:type="dxa" w:w="70"/>
+              <w:right w:type="dxa" w:w="100"/>
+            </w:tcMar>
+          </w:tcPr>
+          <w:p>
+            <w:pPr>
+              <w:keepNext w:val="false"/>
+              <w:spacing w:after="40" w:line="260"/>
+            </w:pPr>
+            <w:r>
+              <w:rPr>
+                <w:rFonts w:ascii="Arial" w:cs="Arial" w:eastAsia="Arial" w:hAnsi="Arial"/>
+                <w:b w:val="false"/>
+                <w:bCs w:val="false"/>
+                <w:color w:val="1E1208"/>
+                <w:sz w:val="18"/>
+                <w:szCs w:val="18"/>
+              </w:rPr>
+              <w:t xml:space="preserve">about $0.09</w:t>
+            </w:r>
+          </w:p>
+        </w:tc>
+        <w:tc>
+          <w:tcPr>
+            <w:tcW w:type="dxa" w:w="2438"/>
+            <w:tcBorders>
+              <w:top w:val="single" w:color="D8CFC2" w:sz="4"/>
+              <w:left w:val="single" w:color="D8CFC2" w:sz="4"/>
+              <w:bottom w:val="single" w:color="D8CFC2" w:sz="4"/>
+              <w:right w:val="single" w:color="D8CFC2" w:sz="4"/>
+            </w:tcBorders>
+            <w:tcMar>
+              <w:top w:type="dxa" w:w="70"/>
+              <w:left w:type="dxa" w:w="100"/>
+              <w:bottom w:type="dxa" w:w="70"/>
+              <w:right w:type="dxa" w:w="100"/>
+            </w:tcMar>
+          </w:tcPr>
+          <w:p>
+            <w:pPr>
+              <w:keepNext w:val="false"/>
+              <w:spacing w:after="40" w:line="260"/>
+            </w:pPr>
+            <w:r>
+              <w:rPr>
+                <w:rFonts w:ascii="Arial" w:cs="Arial" w:eastAsia="Arial" w:hAnsi="Arial"/>
+                <w:b w:val="false"/>
+                <w:bCs w:val="false"/>
+                <w:color w:val="1E1208"/>
+                <w:sz w:val="18"/>
+                <w:szCs w:val="18"/>
+              </w:rPr>
+              <w:t xml:space="preserve">about $0.005</w:t>
             </w:r>
           </w:p>
         </w:tc>
@@ -10356,7 +10463,7 @@
           <w:sz w:val="21"/>
           <w:szCs w:val="21"/>
         </w:rPr>
-        <w:t xml:space="preserve">The allowance caps one student at roughly the Sonnet figure above, so the worst case is predictable.</w:t>
+        <w:t xml:space="preserve">The monthly allowance caps one student, so the worst case is predictable. The lesson guides add almost nothing because they are made once, not per student.</w:t>
       </w:r>
     </w:p>
     <w:p>
@@ -10647,7 +10754,7 @@
                 <w:sz w:val="18"/>
                 <w:szCs w:val="18"/>
               </w:rPr>
-              <w:t xml:space="preserve">Your decisions (section 12), the policy wording, allowances, a short impact assessment, choice of pilot classes.</w:t>
+              <w:t xml:space="preserve">Your decisions (section 12), the wording for teachers, allowances, a short impact assessment, choice of pilot classes.</w:t>
             </w:r>
           </w:p>
         </w:tc>
@@ -10755,7 +10862,7 @@
                 <w:sz w:val="18"/>
                 <w:szCs w:val="18"/>
               </w:rPr>
-              <w:t xml:space="preserve">1. Teacher study packs</w:t>
+              <w:t xml:space="preserve">1. Lesson study guides</w:t>
             </w:r>
           </w:p>
         </w:tc>
@@ -10789,7 +10896,7 @@
                 <w:sz w:val="18"/>
                 <w:szCs w:val="18"/>
               </w:rPr>
-              <w:t xml:space="preserve">F1: upload or pick material, draft cards and quiz, review, assign; students study offline-capable.</w:t>
+              <w:t xml:space="preserve">F1 and F2: a guide drafted from each published lesson, teacher check, the student guide tab, the tutor's quiz mode.</w:t>
             </w:r>
           </w:p>
         </w:tc>
@@ -10823,7 +10930,7 @@
                 <w:sz w:val="18"/>
                 <w:szCs w:val="18"/>
               </w:rPr>
-              <w:t xml:space="preserve">L</w:t>
+              <w:t xml:space="preserve">M</w:t>
             </w:r>
           </w:p>
         </w:tc>
@@ -10857,7 +10964,7 @@
                 <w:sz w:val="18"/>
                 <w:szCs w:val="18"/>
               </w:rPr>
-              <w:t xml:space="preserve">A teacher can make and assign a pack; the accuracy audit passes; cost per pack is known.</w:t>
+              <w:t xml:space="preserve">A teacher can switch a guide on; students can study and quiz; the accuracy audit passes; cost per guide is known.</w:t>
             </w:r>
           </w:p>
         </w:tc>
@@ -10897,7 +11004,7 @@
                 <w:sz w:val="18"/>
                 <w:szCs w:val="18"/>
               </w:rPr>
-              <w:t xml:space="preserve">Pilot A</w:t>
+              <w:t xml:space="preserve">Pilot</w:t>
             </w:r>
           </w:p>
         </w:tc>
@@ -10931,7 +11038,7 @@
                 <w:sz w:val="18"/>
                 <w:szCs w:val="18"/>
               </w:rPr>
-              <w:t xml:space="preserve">Two classes, four weeks, teacher packs only.</w:t>
+              <w:t xml:space="preserve">Two classes for four weeks, using guides on the lessons they already have.</w:t>
             </w:r>
           </w:p>
         </w:tc>
@@ -10999,7 +11106,7 @@
                 <w:sz w:val="18"/>
                 <w:szCs w:val="18"/>
               </w:rPr>
-              <w:t xml:space="preserve">Measures below are met.</w:t>
+              <w:t xml:space="preserve">The measures below are met.</w:t>
             </w:r>
           </w:p>
         </w:tc>
@@ -11039,7 +11146,7 @@
                 <w:sz w:val="18"/>
                 <w:szCs w:val="18"/>
               </w:rPr>
-              <w:t xml:space="preserve">2. Student study packs and Ask your material</w:t>
+              <w:t xml:space="preserve">2. Today's practice</w:t>
             </w:r>
           </w:p>
         </w:tc>
@@ -11073,7 +11180,7 @@
                 <w:sz w:val="18"/>
                 <w:szCs w:val="18"/>
               </w:rPr>
-              <w:t xml:space="preserve">F2 and F3 with personal-data check, allowances and the report button.</w:t>
+              <w:t xml:space="preserve">F3: the daily mixed set.</w:t>
             </w:r>
           </w:p>
         </w:tc>
@@ -11107,7 +11214,7 @@
                 <w:sz w:val="18"/>
                 <w:szCs w:val="18"/>
               </w:rPr>
-              <w:t xml:space="preserve">L</w:t>
+              <w:t xml:space="preserve">M</w:t>
             </w:r>
           </w:p>
         </w:tc>
@@ -11141,7 +11248,7 @@
                 <w:sz w:val="18"/>
                 <w:szCs w:val="18"/>
               </w:rPr>
-              <w:t xml:space="preserve">Students can make packs and ask questions; safety tests pass.</w:t>
+              <w:t xml:space="preserve">The set mixes spacing, weak topics and new questions.</w:t>
             </w:r>
           </w:p>
         </w:tc>
@@ -11181,7 +11288,7 @@
                 <w:sz w:val="18"/>
                 <w:szCs w:val="18"/>
               </w:rPr>
-              <w:t xml:space="preserve">3. Today's practice and photo of notes</w:t>
+              <w:t xml:space="preserve">3. Your own notes</w:t>
             </w:r>
           </w:p>
         </w:tc>
@@ -11215,7 +11322,7 @@
                 <w:sz w:val="18"/>
                 <w:szCs w:val="18"/>
               </w:rPr>
-              <w:t xml:space="preserve">F4 and F5.</w:t>
+              <w:t xml:space="preserve">F4 and F5: upload and photo, with the personal data check, allowances and the report button.</w:t>
             </w:r>
           </w:p>
         </w:tc>
@@ -11249,7 +11356,7 @@
                 <w:sz w:val="18"/>
                 <w:szCs w:val="18"/>
               </w:rPr>
-              <w:t xml:space="preserve">M each</w:t>
+              <w:t xml:space="preserve">L</w:t>
             </w:r>
           </w:p>
         </w:tc>
@@ -11283,7 +11390,7 @@
                 <w:sz w:val="18"/>
                 <w:szCs w:val="18"/>
               </w:rPr>
-              <w:t xml:space="preserve">Daily practice mixes spacing and weak topics; photos read correctly after correction.</w:t>
+              <w:t xml:space="preserve">Students can make packs; safety tests pass.</w:t>
             </w:r>
           </w:p>
         </w:tc>
@@ -11425,7 +11532,7 @@
                 <w:sz w:val="18"/>
                 <w:szCs w:val="18"/>
               </w:rPr>
-              <w:t xml:space="preserve">Listening works offline; a library chapter becomes a pack.</w:t>
+              <w:t xml:space="preserve">Listening works offline; a library chapter becomes a guide.</w:t>
             </w:r>
           </w:p>
         </w:tc>
@@ -12119,7 +12226,7 @@
                 <w:sz w:val="18"/>
                 <w:szCs w:val="18"/>
               </w:rPr>
-              <w:t xml:space="preserve">Uploads are private, never shared, deleted after reading; class packs only from material the school may use.</w:t>
+              <w:t xml:space="preserve">Lesson guides use only the school's own lessons. Later, uploads are private, never shared and deleted after reading.</w:t>
             </w:r>
           </w:p>
         </w:tc>
@@ -12341,7 +12448,7 @@
                 <w:sz w:val="18"/>
                 <w:szCs w:val="18"/>
               </w:rPr>
-              <w:t xml:space="preserve">A fast review screen, bulk approve with spot checks, and sensible defaults.</w:t>
+              <w:t xml:space="preserve">One quick check per lesson, a bulk "draft all" and approve with spot checks, and sensible defaults.</w:t>
             </w:r>
           </w:p>
         </w:tc>
@@ -12704,7 +12811,7 @@
                 <w:sz w:val="18"/>
                 <w:szCs w:val="18"/>
               </w:rPr>
-              <w:t xml:space="preserve">Approve building teacher study packs first?</w:t>
+              <w:t xml:space="preserve">Build lesson study guides first, made from lessons already in Smart Learning?</w:t>
             </w:r>
           </w:p>
         </w:tc>
@@ -12736,7 +12843,7 @@
                 <w:sz w:val="18"/>
                 <w:szCs w:val="18"/>
               </w:rPr>
-              <w:t xml:space="preserve">Yes. It is the safest way to get real accuracy and cost numbers.</w:t>
+              <w:t xml:space="preserve">Yes. It needs no upload and is the safest, cheapest and quickest.</w:t>
             </w:r>
           </w:p>
         </w:tc>
@@ -12805,7 +12912,7 @@
                 <w:sz w:val="18"/>
                 <w:szCs w:val="18"/>
               </w:rPr>
-              <w:t xml:space="preserve">Can students upload their own material in the pilot, or teacher-shared only at first?</w:t>
+              <w:t xml:space="preserve">Must a teacher approve each guide before students see it?</w:t>
             </w:r>
           </w:p>
         </w:tc>
@@ -12837,7 +12944,7 @@
                 <w:sz w:val="18"/>
                 <w:szCs w:val="18"/>
               </w:rPr>
-              <w:t xml:space="preserve">Teacher packs for Pilot A, student upload in Pilot B for two classes.</w:t>
+              <w:t xml:space="preserve">Yes, once per lesson, with a "draft all" button and a quick review screen.</w:t>
             </w:r>
           </w:p>
         </w:tc>
@@ -12906,7 +13013,7 @@
                 <w:sz w:val="18"/>
                 <w:szCs w:val="18"/>
               </w:rPr>
-              <w:t xml:space="preserve">Which file types first?</w:t>
+              <w:t xml:space="preserve">Should the guide be switched on by default for new lessons?</w:t>
             </w:r>
           </w:p>
         </w:tc>
@@ -12938,7 +13045,7 @@
                 <w:sz w:val="18"/>
                 <w:szCs w:val="18"/>
               </w:rPr>
-              <w:t xml:space="preserve">PDF and photos. Word files after.</w:t>
+              <w:t xml:space="preserve">Drafted by default, shown to students only after the teacher switches it on.</w:t>
             </w:r>
           </w:p>
         </w:tc>
@@ -13007,7 +13114,7 @@
                 <w:sz w:val="18"/>
                 <w:szCs w:val="18"/>
               </w:rPr>
-              <w:t xml:space="preserve">Monthly allowance per student?</w:t>
+              <w:t xml:space="preserve">Monthly tutor allowance per student?</w:t>
             </w:r>
           </w:p>
         </w:tc>
@@ -13039,7 +13146,7 @@
                 <w:sz w:val="18"/>
                 <w:szCs w:val="18"/>
               </w:rPr>
-              <w:t xml:space="preserve">10 packs and 100 tutor messages, adjustable by the school.</w:t>
+              <w:t xml:space="preserve">100 messages, adjustable by the school.</w:t>
             </w:r>
           </w:p>
         </w:tc>
@@ -13108,7 +13215,7 @@
                 <w:sz w:val="18"/>
                 <w:szCs w:val="18"/>
               </w:rPr>
-              <w:t xml:space="preserve">How long to keep packs and passages?</w:t>
+              <w:t xml:space="preserve">Student uploads of their own notes: when?</w:t>
             </w:r>
           </w:p>
         </w:tc>
@@ -13140,7 +13247,7 @@
                 <w:sz w:val="18"/>
                 <w:szCs w:val="18"/>
               </w:rPr>
-              <w:t xml:space="preserve">Originals 24 hours; packs until deleted; clear after 12 months unused.</w:t>
+              <w:t xml:space="preserve">After the pilot, in two classes first.</w:t>
             </w:r>
           </w:p>
         </w:tc>
@@ -13645,7 +13752,7 @@
                 <w:sz w:val="18"/>
                 <w:szCs w:val="18"/>
               </w:rPr>
-              <w:t xml:space="preserve">"Study packs", under Smart Learning.</w:t>
+              <w:t xml:space="preserve">"Study guide" on each lesson, under Smart Learning.</w:t>
             </w:r>
           </w:p>
         </w:tc>
@@ -13703,7 +13810,7 @@
         </w:rPr>
         <w:t xml:space="preserve">Turbo AI home: </w:t>
       </w:r>
-      <w:hyperlink w:history="1" r:id="rIdzpw8z3jij-5y0yrwl0ajc">
+      <w:hyperlink w:history="1" r:id="rIdmrxsgqeohnsstehfqz2ej">
         <w:r>
           <w:rPr>
             <w:rFonts w:ascii="Arial" w:cs="Arial" w:eastAsia="Arial" w:hAnsi="Arial"/>
@@ -13733,7 +13840,7 @@
         </w:rPr>
         <w:t xml:space="preserve">Turbo AI for students: </w:t>
       </w:r>
-      <w:hyperlink w:history="1" r:id="rIdfcajhv5ap1gnusawlcvme">
+      <w:hyperlink w:history="1" r:id="rIdwzwk1xwz01mvurvksr4mu">
         <w:r>
           <w:rPr>
             <w:rFonts w:ascii="Arial" w:cs="Arial" w:eastAsia="Arial" w:hAnsi="Arial"/>
@@ -13763,7 +13870,7 @@
         </w:rPr>
         <w:t xml:space="preserve">Turbo AI terms of service: </w:t>
       </w:r>
-      <w:hyperlink w:history="1" r:id="rIdkm4qe8ktpopdquut0sdhc">
+      <w:hyperlink w:history="1" r:id="rId-_oumucre0yhi36a_0fim">
         <w:r>
           <w:rPr>
             <w:rFonts w:ascii="Arial" w:cs="Arial" w:eastAsia="Arial" w:hAnsi="Arial"/>
@@ -13793,7 +13900,7 @@
         </w:rPr>
         <w:t xml:space="preserve">Turbo AI vs ChatGPT (Turbo's own blog): </w:t>
       </w:r>
-      <w:hyperlink w:history="1" r:id="rIdgidj2jcgapzrblszfj1p7">
+      <w:hyperlink w:history="1" r:id="rIdyt1jb0teltjegikh5ey7u">
         <w:r>
           <w:rPr>
             <w:rFonts w:ascii="Arial" w:cs="Arial" w:eastAsia="Arial" w:hAnsi="Arial"/>
@@ -13823,7 +13930,7 @@
         </w:rPr>
         <w:t xml:space="preserve">Turbo AI vs StudyFetch (Turbo's own blog): </w:t>
       </w:r>
-      <w:hyperlink w:history="1" r:id="rIdaqmupcqkyiim6hnobmycg">
+      <w:hyperlink w:history="1" r:id="rIdvcqzp5hh88g2momcpx7ur">
         <w:r>
           <w:rPr>
             <w:rFonts w:ascii="Arial" w:cs="Arial" w:eastAsia="Arial" w:hAnsi="Arial"/>
@@ -13870,7 +13977,7 @@
         </w:rPr>
         <w:t xml:space="preserve">HyScaler review (marketing in tone; pricing and tracking notes): </w:t>
       </w:r>
-      <w:hyperlink w:history="1" r:id="rIdmgq9pk4gqjnguklhtf2s5">
+      <w:hyperlink w:history="1" r:id="rIdjfzrdm3favsuhx_onft5p">
         <w:r>
           <w:rPr>
             <w:rFonts w:ascii="Arial" w:cs="Arial" w:eastAsia="Arial" w:hAnsi="Arial"/>
@@ -13900,7 +14007,7 @@
         </w:rPr>
         <w:t xml:space="preserve">Tools for Humans listing: </w:t>
       </w:r>
-      <w:hyperlink w:history="1" r:id="rIdxpruzhxhkwkyvrchux3wk">
+      <w:hyperlink w:history="1" r:id="rIddrynnrjdgra4utz1p7bgh">
         <w:r>
           <w:rPr>
             <w:rFonts w:ascii="Arial" w:cs="Arial" w:eastAsia="Arial" w:hAnsi="Arial"/>
@@ -13947,7 +14054,7 @@
         </w:rPr>
         <w:t xml:space="preserve">Dunlosky and colleagues (2013), Improving students' learning with effective learning techniques: </w:t>
       </w:r>
-      <w:hyperlink w:history="1" r:id="rIdp4buteryvpi6-kamg_k4n">
+      <w:hyperlink w:history="1" r:id="rIdbmjla657bol40yyqmx9b2">
         <w:r>
           <w:rPr>
             <w:rFonts w:ascii="Arial" w:cs="Arial" w:eastAsia="Arial" w:hAnsi="Arial"/>
@@ -13977,7 +14084,7 @@
         </w:rPr>
         <w:t xml:space="preserve">Bastani and colleagues (2025), Generative AI without guardrails can harm learning, PNAS: </w:t>
       </w:r>
-      <w:hyperlink w:history="1" r:id="rIdtxnmjy_puwwmgfrfptoew">
+      <w:hyperlink w:history="1" r:id="rIdo4aad0w2vn4fdwi0a4vw3">
         <w:r>
           <w:rPr>
             <w:rFonts w:ascii="Arial" w:cs="Arial" w:eastAsia="Arial" w:hAnsi="Arial"/>
@@ -14007,7 +14114,7 @@
         </w:rPr>
         <w:t xml:space="preserve">Wharton summary of the Bastani study: </w:t>
       </w:r>
-      <w:hyperlink w:history="1" r:id="rIdhize66qazn6npxhjkthvu">
+      <w:hyperlink w:history="1" r:id="rIdld9fjdbo-frrwiu0firue">
         <w:r>
           <w:rPr>
             <w:rFonts w:ascii="Arial" w:cs="Arial" w:eastAsia="Arial" w:hAnsi="Arial"/>
@@ -14054,7 +14161,7 @@
         </w:rPr>
         <w:t xml:space="preserve">Anthropic pricing: </w:t>
       </w:r>
-      <w:hyperlink w:history="1" r:id="rIdcgzvuyxnoddhycgssf1pv">
+      <w:hyperlink w:history="1" r:id="rIddymgfrhvbdoavkp3lzha7">
         <w:r>
           <w:rPr>
             <w:rFonts w:ascii="Arial" w:cs="Arial" w:eastAsia="Arial" w:hAnsi="Arial"/>

</xml_diff>